<commit_message>
Agrega la evidencia de la corrida final de pruebas (065b2d5) y actualiza los manuales de los anexos
</commit_message>
<xml_diff>
--- a/docs/anexos/Guia_Despliegue_Portal_UTS.docx
+++ b/docs/anexos/Guia_Despliegue_Portal_UTS.docx
@@ -44,7 +44,7 @@
           <w:sz w:val="26"/>
           <w:szCs w:val="26"/>
         </w:rPr>
-        <w:t xml:space="preserve">Cómo está desplegado el portal en Render y cómo mantenerlo en producción</w:t>
+        <w:t xml:space="preserve">Cómo está desplegado el portal en Render y cómo mantenerlo</w:t>
       </w:r>
     </w:p>
     <w:p>
@@ -70,7 +70,7 @@
           <w:sz w:val="21"/>
           <w:szCs w:val="21"/>
         </w:rPr>
-        <w:t xml:space="preserve">Elaborado a partir de la configuración real verificada en la cuenta de Render del proyecto (servicio web y base de datos), no de un plan preliminar.</w:t>
+        <w:t xml:space="preserve">Elaborado a partir de la configuración real verificada en la cuenta de Render del proyecto (servicio web y base de datos), no de un plan preliminar. Versión documentada: código del repositorio en el commit 065b2d5 (2 de octubre de 2026), el último del sistema evaluado en el informe F-DC-125.</w:t>
       </w:r>
     </w:p>
     <w:p>
@@ -389,7 +389,7 @@
                 <w:sz w:val="21"/>
                 <w:szCs w:val="21"/>
               </w:rPr>
-              <w:t xml:space="preserve">portal-uts (srv-dao0hd3tqb8s73deut5g) — contenedor Docker, plan Standard (1c-2g: 1 vCPU, 2 GB de RAM) desde el 21/9/2026 (antes, plan gratuito), región Oregon. URL pública: https://portal-uts-k888.onrender.com</w:t>
+              <w:t xml:space="preserve">portal-uts (srv-dao0hd3tqb8s73deut5g) — contenedor Docker, plan Standard (1c-2g: 1 vCPU, 2 GB de RAM), activado por primera vez el 20/9/2026 y alternado desde entonces con el plan gratuito según las necesidades de evaluación (para controlar costos mientras el portal no tiene usuarios reales); confirmado en Standard al 1/10/2026. Región Oregon. URL pública: https://portal-uts-k888.onrender.com</w:t>
             </w:r>
           </w:p>
         </w:tc>
@@ -505,7 +505,7 @@
                 <w:sz w:val="21"/>
                 <w:szCs w:val="21"/>
               </w:rPr>
-              <w:t xml:space="preserve">Esta guía no incluye contraseñas ni cadenas de conexión reales en ningún punto, por acuerdo del proyecto. Los valores reales viven únicamente en las variables de entorno del panel de Render (pestaña Environment de cada servicio) y no se guardan en el repositorio ni en ningún documento.</w:t>
+              <w:t xml:space="preserve">Esta guía no incluye contraseñas ni cadenas de conexión reales en ningún punto, por acuerdo del proyecto. Los valores reales viven únicamente en las variables de entorno del panel de Render (pestaña Environment de cada servicio) y no se guardan en el repositorio ni en ningún documento. Si se necesita un acceso de demostración para evaluar el panel, debe tratarse como una cuenta temporal, creada para ese fin y entregada por un medio separado de este documento; nunca se publica en el repositorio ni en los anexos del informe.</w:t>
             </w:r>
           </w:p>
         </w:tc>
@@ -579,7 +579,7 @@
           <w:sz w:val="22"/>
           <w:szCs w:val="22"/>
         </w:rPr>
-        <w:t xml:space="preserve">El valor de la contraseña inicial del administrador técnico, para definirla como variable de entorno la primera vez (ver sección 5) — no hace falta si el servicio ya tiene usuarios creados.</w:t>
+        <w:t xml:space="preserve">El valor de la contraseña inicial del administrador, para definirla como variable de entorno la primera vez (ver sección 5) — no hace falta si el servicio ya tiene usuarios creados.</w:t>
       </w:r>
     </w:p>
     <w:p>
@@ -783,7 +783,7 @@
           <w:sz w:val="22"/>
           <w:szCs w:val="22"/>
         </w:rPr>
-        <w:t xml:space="preserve">El desarrollo local se hace directamente con el wrapper de Maven (./mvnw spring-boot:run), sin Docker. El Dockerfile existe únicamente para que Render sepa cómo construir y ejecutar la aplicación en producción.</w:t>
+        <w:t xml:space="preserve">El desarrollo local se hace directamente con el wrapper de Maven (./mvnw spring-boot:run), sin Docker. El Dockerfile existe únicamente para que Render sepa cómo construir y ejecutar la aplicación en Render.</w:t>
       </w:r>
     </w:p>
     <w:p>
@@ -895,7 +895,7 @@
           <w:sz w:val="22"/>
           <w:szCs w:val="22"/>
         </w:rPr>
-        <w:t xml:space="preserve">Estos valores se definieron mientras el servicio todavía estaba en el plan gratuito de Render, que limitaba el contenedor a 512 MB de RAM y muy poca CPU, y lo terminaba sin aviso si se excedía ese límite. Los valores de JAVA_OPTS del Dockerfile son el resultado de varias iteraciones reales — dos configuraciones anteriores fallaron de forma distinta antes de llegar a esta. Desde el 21/9/2026 el servicio está en el plan Standard (1c-2g: 1 vCPU, 2 GB de RAM); el Dockerfile no se ha vuelto a ajustar desde entonces, así que sigue funcionando con la configuración conservadora pensada para 512 MB — no es un error, solo una oportunidad de ajuste todavía no aprovechada, ya que con más memoria disponible se podría permitir un heap mayor o un recolector de basura distinto:</w:t>
+        <w:t xml:space="preserve">Estos valores se definieron mientras el servicio todavía estaba en el plan gratuito de Render, que limitaba el contenedor a 512 MB de RAM y muy poca CPU, y lo terminaba sin aviso si se excedía ese límite. Los valores de JAVA_OPTS del Dockerfile son el resultado de varias iteraciones reales — dos configuraciones anteriores fallaron de forma distinta antes de llegar a esta. El servicio se activó por primera vez en plan Standard (1c-2g: 1 vCPU, 2 GB de RAM) el 20/9/2026 y desde entonces alterna con el plan gratuito; el Dockerfile no se ha vuelto a ajustar desde entonces, así que sigue funcionando con la configuración conservadora pensada para 512 MB — no es un error, solo una oportunidad de ajuste todavía no aprovechada, ya que con más memoria disponible se podría permitir un heap mayor o un recolector de basura distinto:</w:t>
       </w:r>
     </w:p>
     <w:p>
@@ -1310,7 +1310,7 @@
                 <w:sz w:val="22"/>
                 <w:szCs w:val="22"/>
               </w:rPr>
-              <w:t xml:space="preserve">Si el servicio empieza a reiniciarse solo o a rechazar peticiones después de un cambio grande en el código, revisar primero los logs de Render buscando “OutOfMemoryError” — es la causa más probable dado el límite de 512 MB, y ya ha pasado antes durante el desarrollo de este proyecto.</w:t>
+              <w:t xml:space="preserve">Si el servicio empieza a reiniciarse solo o a rechazar peticiones después de un cambio grande en el código, revisar primero los logs de Render buscando “OutOfMemoryError” — es la causa más probable dado el límite de 512 MB del plan gratuito, y ya ha pasado antes durante el desarrollo de este proyecto.</w:t>
             </w:r>
           </w:p>
         </w:tc>
@@ -1506,7 +1506,7 @@
                 <w:sz w:val="21"/>
                 <w:szCs w:val="21"/>
               </w:rPr>
-              <w:t xml:space="preserve">Contraseña del primer administrador técnico. Marcada sync: false en render.yaml — es decir, Render la pide una sola vez por el panel y no la guarda en el repositorio. Solo se usa si la tabla usuario está vacía al arrancar; en un servicio ya inicializado no tiene efecto.</w:t>
+              <w:t xml:space="preserve">Contraseña del primer administrador. Marcada sync: false en render.yaml — es decir, Render la pide una sola vez por el panel y no la guarda en el repositorio. Solo se usa si la tabla usuario está vacía al arrancar; en un servicio ya inicializado no tiene efecto.</w:t>
             </w:r>
           </w:p>
         </w:tc>
@@ -2040,7 +2040,7 @@
           <w:sz w:val="22"/>
           <w:szCs w:val="22"/>
         </w:rPr>
-        <w:t xml:space="preserve">Un inicio de sesión de administrador funciona (/login) y el panel carga según el rol de esa cuenta.</w:t>
+        <w:t xml:space="preserve">Un inicio de sesión de administrador funciona (/login) y el panel carga con las opciones de administración habilitadas para esa cuenta.</w:t>
       </w:r>
     </w:p>
     <w:p>
@@ -2128,7 +2128,7 @@
           <w:sz w:val="22"/>
           <w:szCs w:val="22"/>
         </w:rPr>
-        <w:t xml:space="preserve">El servicio web está en el plan Standard desde el 21/9/2026 (1c-2g: 1 vCPU, 2 GB de RAM); ya no aplica el límite de 512 MB del plan gratuito, aunque el Dockerfile sigue con los JAVA_OPTS conservadores de esa etapa (ver sección 4.3) — hay margen para revisarlos si un cambio futuro aumenta mucho el uso de memoria.</w:t>
+        <w:t xml:space="preserve">El servicio web se activó por primera vez en plan Standard el 20/9/2026 (1c-2g: 1 vCPU, 2 GB de RAM) y desde entonces alterna con el plan gratuito; mientras está en Standard no aplica el límite de 512 MB del plan gratuito, aunque el Dockerfile sigue con los JAVA_OPTS conservadores de esa etapa (ver sección 4.3) — hay margen para revisarlos si un cambio futuro aumenta mucho el uso de memoria.</w:t>
       </w:r>
     </w:p>
     <w:p>
@@ -2145,7 +2145,7 @@
           <w:sz w:val="22"/>
           <w:szCs w:val="22"/>
         </w:rPr>
-        <w:t xml:space="preserve">Mientras el servicio web estuvo en el plan gratuito de Render (hasta el 21/9/2026), “dormía” tras un período sin tráfico y tardaba unos segundos en responder la primera petición después de eso — era normal en ese plan, no una falla. Desde que pasó al plan Standard ya no ocurre: el servicio permanece activo todo el tiempo.</w:t>
+        <w:t xml:space="preserve">Mientras el servicio web está en el plan gratuito de Render, “duerme” tras un período sin tráfico y tarda unos segundos en responder la primera petición después de eso — es normal en ese plan, no una falla. En el plan Standard no ocurre: el servicio permanece activo.</w:t>
       </w:r>
     </w:p>
     <w:p>

</xml_diff>